<commit_message>
Enhanced debugging and closures worked out
</commit_message>
<xml_diff>
--- a/Scraps_Language_Design.docx
+++ b/Scraps_Language_Design.docx
@@ -626,7 +626,7 @@
           <w:sz w:val="24"/>
           <w:sz-cs w:val="24"/>
         </w:rPr>
-        <w:t xml:space="preserve">⬜</w:t>
+        <w:t xml:space="preserve">✅</w:t>
       </w:r>
       <w:r>
         <w:rPr>
@@ -667,7 +667,7 @@
           <w:sz w:val="24"/>
           <w:sz-cs w:val="24"/>
         </w:rPr>
-        <w:t xml:space="preserve">⬜</w:t>
+        <w:t xml:space="preserve">✅</w:t>
       </w:r>
       <w:r>
         <w:rPr>

</xml_diff>